<commit_message>
docs(submission): add graphical abstract, alt-text form, and five-author ethical declarations
Co-Authored-By: Claude Fable 5 <noreply@anthropic.com>
Claude-Session: https://claude.ai/code/session_01PXteLoEJ47ztdLQyNFxNJ9
</commit_message>
<xml_diff>
--- a/submission_files/Liu_2026_CCLM_ethical_legal_declarations.docx
+++ b/submission_files/Liu_2026_CCLM_ethical_legal_declarations.docx
@@ -401,19 +401,13 @@
             <w:tcW w:w="6513" w:type="dxa"/>
           </w:tcPr>
           <w:p>
-            <w:pPr>
-              <w:pStyle w:val="14"/>
+            <w:r/>
+            <w:r>
               <w:rPr>
-                <w:rStyle w:val="7"/>
-                <w:b w:val="0"/>
-                <w:bCs w:val="0"/>
-                <w:sz w:val="24"/>
-                <w:szCs w:val="24"/>
-                <w:lang w:val="en-US"/>
+                <w:rFonts w:ascii="Times New Roman" w:hAnsi="Times New Roman"/>
+                <w:sz w:val="20"/>
               </w:rPr>
-            </w:pPr>
-            <w:r>
-              <w:t>The author thanks the two colleagues who participated in the blinded expert review (Raters 2 and 3) for providing an independent expert perspective with full informed consent.</w:t>
+              <w:t>Not applicable.</w:t>
             </w:r>
           </w:p>
         </w:tc>
@@ -452,18 +446,12 @@
             <w:tcW w:w="6513" w:type="dxa"/>
           </w:tcPr>
           <w:p>
-            <w:pPr>
-              <w:pStyle w:val="14"/>
+            <w:r/>
+            <w:r>
               <w:rPr>
-                <w:rStyle w:val="7"/>
-                <w:b w:val="0"/>
-                <w:bCs w:val="0"/>
-                <w:sz w:val="24"/>
-                <w:szCs w:val="24"/>
-                <w:lang w:val="en-US"/>
+                <w:rFonts w:ascii="Times New Roman" w:hAnsi="Times New Roman"/>
+                <w:sz w:val="20"/>
               </w:rPr>
-            </w:pPr>
-            <w:r>
               <w:t>Not applicable. This study did not involve patient data, biological samples, or human intervention. The quality management system documents generated and evaluated used fictitious placeholder names (e.g., "Dr Li", "Dr Zhang") and contained no identifiable personal information; rater-level identifying data are stored under coded labels (Rater 1 / Rater 2 / Rater 3) in the released dataset.</w:t>
             </w:r>
           </w:p>
@@ -503,19 +491,13 @@
             <w:tcW w:w="6513" w:type="dxa"/>
           </w:tcPr>
           <w:p>
-            <w:pPr>
-              <w:pStyle w:val="14"/>
+            <w:r/>
+            <w:r>
               <w:rPr>
-                <w:rStyle w:val="7"/>
-                <w:b w:val="0"/>
-                <w:bCs w:val="0"/>
-                <w:sz w:val="24"/>
-                <w:szCs w:val="24"/>
-                <w:lang w:val="en-US"/>
+                <w:rFonts w:ascii="Times New Roman" w:hAnsi="Times New Roman"/>
+                <w:sz w:val="20"/>
               </w:rPr>
-            </w:pPr>
-            <w:r>
-              <w:t>Informed consent was obtained from all individuals included in this study. Written informed consent was obtained from Raters 2 and 3 prior to their participation in the blinded expert review; the consent form described the study purpose, the intended use of the ratings, the data-handling and de-identification procedures, and the right to withdraw at any time.</w:t>
+              <w:t>Informed consent was obtained from all individuals included in this study. Written informed consent was obtained from the two colleagues who served as Raters 2 and 3 (Lan Yang and Xinying Chen, now co-authors) prior to their participation in the blinded expert review; the consent form described the study purpose, the intended use of the ratings, the data-handling and de-identification procedures, and the right to withdraw at any time.</w:t>
             </w:r>
           </w:p>
         </w:tc>
@@ -554,19 +536,13 @@
             <w:tcW w:w="6513" w:type="dxa"/>
           </w:tcPr>
           <w:p>
-            <w:pPr>
-              <w:pStyle w:val="14"/>
+            <w:r/>
+            <w:r>
               <w:rPr>
-                <w:rStyle w:val="7"/>
-                <w:b w:val="0"/>
-                <w:bCs w:val="0"/>
-                <w:sz w:val="24"/>
-                <w:szCs w:val="24"/>
-                <w:lang w:val="en-US"/>
+                <w:rFonts w:ascii="Times New Roman" w:hAnsi="Times New Roman"/>
+                <w:sz w:val="20"/>
               </w:rPr>
-            </w:pPr>
-            <w:r>
-              <w:t>The author has accepted responsibility for the entire content of this manuscript and approved its submission. Sidi Liu (sole author) was responsible for the conceptualisation and design of the study, the conduct of all experiments, the data analysis, and the drafting and finalisation of the manuscript.</w:t>
+              <w:t>All authors have accepted responsibility for the entire content of this manuscript and approved its submission. Sidi Liu: conceptualization and design of the study, conduct of all experiments, data analysis, and drafting and revision of the manuscript. Lan Yang and Xinying Chen: independent raters in the blinded expert review (Raters 2 and 3, respectively). Dan Wu: data curation. Dongdong Li: study supervision and critical revision of the manuscript; as corresponding author, takes responsibility for the content of the article.</w:t>
             </w:r>
           </w:p>
         </w:tc>
@@ -605,19 +581,13 @@
             <w:tcW w:w="6513" w:type="dxa"/>
           </w:tcPr>
           <w:p>
-            <w:pPr>
-              <w:spacing w:after="4" w:line="240" w:lineRule="auto"/>
+            <w:r/>
+            <w:r>
               <w:rPr>
-                <w:rStyle w:val="7"/>
-                <w:b w:val="0"/>
-                <w:bCs w:val="0"/>
-                <w:sz w:val="24"/>
-                <w:szCs w:val="24"/>
-                <w:lang w:val="en-US"/>
+                <w:rFonts w:ascii="Times New Roman" w:hAnsi="Times New Roman"/>
+                <w:sz w:val="20"/>
               </w:rPr>
-            </w:pPr>
-            <w:r>
-              <w:t>Generative AI tools were used in this study in three documented roles: (i) as research subjects—486 quality-management-system (QMS) documents were generated by Claude Opus 4.6 (Anthropic) and GPT-5.4 (OpenAI) as the primary experimental data; (ii) as methodological instruments—Claude Opus 4.6 and GPT-5.4 served as judges in the LLM-as-judge evaluation framework, producing 864 ratings; and (iii) as drafting assistance—Claude Opus 4.6 was used to assist with English-language drafting and structural editing of the manuscript under the author's direct supervision, with all AI-assisted text reviewed, verified, and revised by the author. No AI tools were used to generate or manipulate figures, data, or analyses; all figures were produced using matplotlib from raw JSON data. No part of the manuscript was uploaded to third-party AI grammar or review services. The author takes full responsibility for the content of the manuscript.</w:t>
+              <w:t>Generative AI tools were used in this study in three documented roles: (i) as research subjects—486 quality-management-system (QMS) documents were generated by Claude Opus 4.6 (Anthropic) and GPT-5.4 (OpenAI) as the primary experimental data; (ii) as methodological instruments—Claude Opus 4.6 and GPT-5.4 served as judges in the LLM-as-judge evaluation framework, producing 864 document-level ratings; and (iii) as drafting assistance—Claude Opus 4.6 was used to assist with English-language drafting, table preparation, and data-visualization code, under the authors' direct supervision, with all AI-assisted text and code reviewed, verified, and revised by the authors. No AI tools were used to generate or manipulate figures, data, or analyses; all figures were produced with matplotlib 3.7.1 from raw JSON data. No part of the manuscript was uploaded to third-party AI grammar or review services. The authors take full responsibility for the content of the manuscript.</w:t>
             </w:r>
           </w:p>
         </w:tc>
@@ -656,19 +626,13 @@
             <w:tcW w:w="6513" w:type="dxa"/>
           </w:tcPr>
           <w:p>
-            <w:pPr>
-              <w:pStyle w:val="14"/>
+            <w:r/>
+            <w:r>
               <w:rPr>
-                <w:rStyle w:val="7"/>
-                <w:b w:val="0"/>
-                <w:bCs w:val="0"/>
-                <w:sz w:val="24"/>
-                <w:szCs w:val="24"/>
-                <w:lang w:val="en-US"/>
+                <w:rFonts w:ascii="Times New Roman" w:hAnsi="Times New Roman"/>
+                <w:sz w:val="20"/>
               </w:rPr>
-            </w:pPr>
-            <w:r>
-              <w:t>The author states no conflict of interest. The author has no commercial, research, or consulting relationship with Anthropic, OpenAI, or any other large language model provider; no funding or in-kind support was received from these entities for this study.</w:t>
+              <w:t>The authors state no conflict of interest. No author has a commercial, research, or consulting relationship with Anthropic, OpenAI, or any other large language model provider; no funding or in-kind support was received from these entities for this study.</w:t>
             </w:r>
           </w:p>
         </w:tc>
@@ -707,18 +671,12 @@
             <w:tcW w:w="6513" w:type="dxa"/>
           </w:tcPr>
           <w:p>
-            <w:pPr>
-              <w:pStyle w:val="14"/>
+            <w:r/>
+            <w:r>
               <w:rPr>
-                <w:rStyle w:val="7"/>
-                <w:b w:val="0"/>
-                <w:bCs w:val="0"/>
-                <w:sz w:val="24"/>
-                <w:szCs w:val="24"/>
-                <w:lang w:val="en-US"/>
+                <w:rFonts w:ascii="Times New Roman" w:hAnsi="Times New Roman"/>
+                <w:sz w:val="20"/>
               </w:rPr>
-            </w:pPr>
-            <w:r>
               <w:t>None declared.</w:t>
             </w:r>
           </w:p>
@@ -758,19 +716,13 @@
             <w:tcW w:w="6513" w:type="dxa"/>
           </w:tcPr>
           <w:p>
-            <w:pPr>
-              <w:pStyle w:val="14"/>
+            <w:r/>
+            <w:r>
               <w:rPr>
-                <w:rStyle w:val="7"/>
-                <w:b w:val="0"/>
-                <w:bCs w:val="0"/>
-                <w:sz w:val="24"/>
-                <w:szCs w:val="24"/>
-                <w:lang w:val="en-US"/>
+                <w:rFonts w:ascii="Times New Roman" w:hAnsi="Times New Roman"/>
+                <w:sz w:val="20"/>
               </w:rPr>
-            </w:pPr>
-            <w:r>
-              <w:t>The 486 generated documents, 864 LLM-as-judge ratings, 30 blinded expert ratings, and all analysis code are openly available on GitHub (https://github.com/stttttte/iso15189-llm-config-experiment) under a dual licence: MIT for code and CC BY 4.0 for data. A versioned snapshot has been archived on Zenodo (DOI: 10.5281/zenodo.20091464).</w:t>
+              <w:t>The 486 generated documents, 864 LLM-as-judge ratings, 30 blinded expert ratings, and all analysis code are openly available on GitHub (https://github.com/stttttte/iso15189-llm-config-experiment) under a dual license: MIT for code and CC BY 4.0 for data. A versioned snapshot has been archived on Zenodo (DOI: 10.5281/zenodo.20091463).</w:t>
             </w:r>
           </w:p>
         </w:tc>

</xml_diff>